<commit_message>
docs(site): revue du site internet — polices sans doublons, une seule FAQ, fiche 6 renvoie aux CGV
Le site vit hors du dépôt (gestion/prive, copie sur le Bureau) : seuls le
journal et la fiche 6 sont versionnés.

Co-Authored-By: Claude Opus 5.5 <noreply@anthropic.com>
</commit_message>
<xml_diff>
--- a/gestion/6 - Prix.docx
+++ b/gestion/6 - Prix.docx
@@ -1281,24 +1281,7 @@
           <w:sz w:val="22"/>
           <w:szCs w:val="22"/>
         </w:rPr>
-        <w:t>Conditions d'</w:t>
-      </w:r>
-      <w:r>
-        <w:rPr>
-          <w:rStyle w:val="lev"/>
-          <w:rFonts w:ascii="Calibri" w:eastAsia="Times New Roman" w:hAnsi="Calibri" w:cs="Calibri"/>
-          <w:sz w:val="22"/>
-          <w:szCs w:val="22"/>
-        </w:rPr>
-        <w:t>annulation</w:t>
-      </w:r>
-      <w:r>
-        <w:rPr>
-          <w:rFonts w:ascii="Calibri" w:eastAsia="Times New Roman" w:hAnsi="Calibri" w:cs="Calibri"/>
-          <w:sz w:val="22"/>
-          <w:szCs w:val="22"/>
-        </w:rPr>
-        <w:t xml:space="preserve"> par le client (acompte ? délai ?).</w:t>
+        <w:t xml:space="preserve">Conditions d'annulation : déjà fixées dans les CGV du site (pas d'acompte ; annulation gratuite jusqu'à 48 h avant).</w:t>
       </w:r>
     </w:p>
     <w:p>

</xml_diff>